<commit_message>
roadmap: re-date Germany plan to 12 Aug 2026 — Winter 2026 closed, Summer 2027 primary, updated timeline
</commit_message>
<xml_diff>
--- a/outputs/goc/Germany_MSc_AI_ML_Roadmap.docx
+++ b/outputs/goc/Germany_MSc_AI_ML_Roadmap.docx
@@ -38,7 +38,7 @@
           <w:color w:val="555F6E"/>
           <w:sz w:val="20"/>
         </w:rPr>
-        <w:t>Saurabh Mandal · base: Virar, Maharashtra (sister's place) · Aug 2026</w:t>
+        <w:t>Saurabh Mandal · base: Virar, Maharashtra (sister's place) · 12 August 2026</w:t>
         <w:br/>
       </w:r>
     </w:p>
@@ -48,7 +48,7 @@
           <w:color w:val="555F6E"/>
           <w:sz w:val="18"/>
         </w:rPr>
-        <w:t>Facts checked Aug 2026. Requirements change yearly — verify on DAAD.de, uni-assist, and APS India before submitting.</w:t>
+        <w:t>Facts checked 12 Aug 2026. Requirements change yearly — verify on DAAD.de, uni-assist, and APS India before submitting. TODAY = 12 Aug 2026.</w:t>
       </w:r>
     </w:p>
     <w:p>
@@ -282,7 +282,7 @@
           <w:color w:val="0F1B2D"/>
           <w:sz w:val="32"/>
         </w:rPr>
-        <w:t>2. Intake Options</w:t>
+        <w:t>2. Intake Options (as of 12 Aug 2026)</w:t>
       </w:r>
     </w:p>
     <w:tbl>
@@ -324,7 +324,7 @@
           </w:tcPr>
           <w:p>
             <w:r>
-              <w:t>German target</w:t>
+              <w:t>Status</w:t>
             </w:r>
           </w:p>
         </w:tc>
@@ -356,7 +356,7 @@
           </w:tcPr>
           <w:p>
             <w:r>
-              <w:t>Oct 2026 — ~14 months away</w:t>
+              <w:t>Oct 2026 — 6 weeks away</w:t>
             </w:r>
           </w:p>
         </w:tc>
@@ -366,7 +366,7 @@
           </w:tcPr>
           <w:p>
             <w:r>
-              <w:t>B1 (visa minimum)</w:t>
+              <w:t>Application windows mostly closed; visa lead time 6–12 wks impossible</w:t>
             </w:r>
           </w:p>
         </w:tc>
@@ -376,7 +376,7 @@
           </w:tcPr>
           <w:p>
             <w:r>
-              <w:t>Tight but possible if APS + Goethe start NOW</w:t>
+              <w:t>❌ Effectively missed — do not chase</w:t>
             </w:r>
           </w:p>
         </w:tc>
@@ -398,7 +398,7 @@
           </w:tcPr>
           <w:p>
             <w:r>
-              <w:t>Apr 2027 — ~20 months away</w:t>
+              <w:t>Apr 2027 — ~8 months away</w:t>
             </w:r>
           </w:p>
         </w:tc>
@@ -408,7 +408,7 @@
           </w:tcPr>
           <w:p>
             <w:r>
-              <w:t>B2 preferred</w:t>
+              <w:t>Applications open Sep–Nov 2026; deadlines Nov 2026–Jan 2027</w:t>
             </w:r>
           </w:p>
         </w:tc>
@@ -418,7 +418,49 @@
           </w:tcPr>
           <w:p>
             <w:r>
-              <w:t>Safest, recommended</w:t>
+              <w:t>✅ THE realistic target</w:t>
+            </w:r>
+          </w:p>
+        </w:tc>
+      </w:tr>
+      <w:tr>
+        <w:tc>
+          <w:tcPr>
+            <w:tcW w:type="dxa" w:w="2160"/>
+          </w:tcPr>
+          <w:p>
+            <w:r>
+              <w:t>Winter 2027</w:t>
+            </w:r>
+          </w:p>
+        </w:tc>
+        <w:tc>
+          <w:tcPr>
+            <w:tcW w:type="dxa" w:w="2160"/>
+          </w:tcPr>
+          <w:p>
+            <w:r>
+              <w:t>Oct 2027 — 14 months away</w:t>
+            </w:r>
+          </w:p>
+        </w:tc>
+        <w:tc>
+          <w:tcPr>
+            <w:tcW w:type="dxa" w:w="2160"/>
+          </w:tcPr>
+          <w:p>
+            <w:r>
+              <w:t>Backup if Summer 2027 slips</w:t>
+            </w:r>
+          </w:p>
+        </w:tc>
+        <w:tc>
+          <w:tcPr>
+            <w:tcW w:type="dxa" w:w="2160"/>
+          </w:tcPr>
+          <w:p>
+            <w:r>
+              <w:t>Plan B</w:t>
             </w:r>
           </w:p>
         </w:tc>
@@ -427,7 +469,7 @@
     <w:p/>
     <w:p>
       <w:r>
-        <w:t>Recommendation: aim Summer 2027. Use the extra 6 months for B2 + savings + university list refinement.</w:t>
+        <w:t>Recommendation: Summer 2027 is now the primary goal. Winter 2026 is unrealistic (visa alone needs 6–12 weeks after admission). Everything below is dated for Summer 2027.</w:t>
       </w:r>
     </w:p>
     <w:p>
@@ -757,7 +799,7 @@
           <w:color w:val="0F1B2D"/>
           <w:sz w:val="32"/>
         </w:rPr>
-        <w:t>5. German Study Plan (Virar, Maharashtra)</w:t>
+        <w:t>5. German Study Plan (Virar, Maharashtra — from Aug 2026)</w:t>
       </w:r>
     </w:p>
     <w:tbl>
@@ -830,7 +872,7 @@
           </w:tcPr>
           <w:p>
             <w:r>
-              <w:t>Online/Goethe Mumbai — ~3 months</w:t>
+              <w:t>Online/Goethe Mumbai — ~3–4 months</w:t>
             </w:r>
           </w:p>
         </w:tc>
@@ -852,7 +894,7 @@
           </w:tcPr>
           <w:p>
             <w:r>
-              <w:t>Mar 2027</w:t>
+              <w:t>Apr 2027</w:t>
             </w:r>
           </w:p>
         </w:tc>
@@ -884,7 +926,7 @@
           </w:tcPr>
           <w:p>
             <w:r>
-              <w:t>Jun 2027</w:t>
+              <w:t>Jul 2027</w:t>
             </w:r>
           </w:p>
         </w:tc>
@@ -894,7 +936,7 @@
           </w:tcPr>
           <w:p>
             <w:r>
-              <w:t>Exam — visa minimum</w:t>
+              <w:t>Exam — visa minimum (for Summer 2027 entry)</w:t>
             </w:r>
           </w:p>
         </w:tc>
@@ -916,7 +958,7 @@
           </w:tcPr>
           <w:p>
             <w:r>
-              <w:t>Sep 2027</w:t>
+              <w:t>Dec 2027</w:t>
             </w:r>
           </w:p>
         </w:tc>
@@ -926,7 +968,7 @@
           </w:tcPr>
           <w:p>
             <w:r>
-              <w:t>Stronger employability</w:t>
+              <w:t>Stronger employability / winter 2027 backup</w:t>
             </w:r>
           </w:p>
         </w:tc>
@@ -1160,7 +1202,7 @@
           <w:color w:val="0F1B2D"/>
           <w:sz w:val="32"/>
         </w:rPr>
-        <w:t>7. Month-by-Month Plan (to Summer 2027)</w:t>
+        <w:t>7. Month-by-Month Plan (12 Aug 2026 → Summer 2027)</w:t>
       </w:r>
     </w:p>
     <w:tbl>
@@ -1202,7 +1244,7 @@
           </w:tcPr>
           <w:p>
             <w:r>
-              <w:t>Aug 2026</w:t>
+              <w:t>Aug 2026 (NOW)</w:t>
             </w:r>
           </w:p>
         </w:tc>
@@ -1212,7 +1254,7 @@
           </w:tcPr>
           <w:p>
             <w:r>
-              <w:t>Start APS application; open Goethe A1</w:t>
+              <w:t>Apply APS immediately; book Goethe A1; open blocked-account research</w:t>
             </w:r>
           </w:p>
         </w:tc>
@@ -1224,7 +1266,7 @@
           </w:tcPr>
           <w:p>
             <w:r>
-              <w:t>Sep–Nov 2026</w:t>
+              <w:t>Sep–Oct 2026</w:t>
             </w:r>
           </w:p>
         </w:tc>
@@ -1234,7 +1276,29 @@
           </w:tcPr>
           <w:p>
             <w:r>
-              <w:t>A1 classes; start university shortlist; resume refresh</w:t>
+              <w:t>A1 classes; university shortlist final; watch summer-2027 portals open</w:t>
+            </w:r>
+          </w:p>
+        </w:tc>
+      </w:tr>
+      <w:tr>
+        <w:tc>
+          <w:tcPr>
+            <w:tcW w:type="dxa" w:w="4320"/>
+          </w:tcPr>
+          <w:p>
+            <w:r>
+              <w:t>Nov 2026</w:t>
+            </w:r>
+          </w:p>
+        </w:tc>
+        <w:tc>
+          <w:tcPr>
+            <w:tcW w:type="dxa" w:w="4320"/>
+          </w:tcPr>
+          <w:p>
+            <w:r>
+              <w:t>A1 exam; submit uni applications (first deadlines Nov 2026–Jan 2027)</w:t>
             </w:r>
           </w:p>
         </w:tc>
@@ -1256,7 +1320,7 @@
           </w:tcPr>
           <w:p>
             <w:r>
-              <w:t>A1 exam; submit APS (if not yet)</w:t>
+              <w:t>A2 starts; submit remaining applications</w:t>
             </w:r>
           </w:p>
         </w:tc>
@@ -1268,7 +1332,7 @@
           </w:tcPr>
           <w:p>
             <w:r>
-              <w:t>Jan–Mar 2027</w:t>
+              <w:t>Jan–Feb 2027</w:t>
             </w:r>
           </w:p>
         </w:tc>
@@ -1278,7 +1342,7 @@
           </w:tcPr>
           <w:p>
             <w:r>
-              <w:t>A2 classes; uni applications open — apply 4–6 unis</w:t>
+              <w:t>A2 exam; admission letters start arriving</w:t>
             </w:r>
           </w:p>
         </w:tc>
@@ -1290,7 +1354,7 @@
           </w:tcPr>
           <w:p>
             <w:r>
-              <w:t>Apr–Jun 2027</w:t>
+              <w:t>Mar–Apr 2027</w:t>
             </w:r>
           </w:p>
         </w:tc>
@@ -1300,7 +1364,29 @@
           </w:tcPr>
           <w:p>
             <w:r>
-              <w:t>B1 exam; admission letters; blocked account start</w:t>
+              <w:t>B1 classes; accept admission; blocked account funding (€11,904)</w:t>
+            </w:r>
+          </w:p>
+        </w:tc>
+      </w:tr>
+      <w:tr>
+        <w:tc>
+          <w:tcPr>
+            <w:tcW w:type="dxa" w:w="4320"/>
+          </w:tcPr>
+          <w:p>
+            <w:r>
+              <w:t>May–Jun 2027</w:t>
+            </w:r>
+          </w:p>
+        </w:tc>
+        <w:tc>
+          <w:tcPr>
+            <w:tcW w:type="dxa" w:w="4320"/>
+          </w:tcPr>
+          <w:p>
+            <w:r>
+              <w:t>B1 exam; visa appointment (German embassy)</w:t>
             </w:r>
           </w:p>
         </w:tc>
@@ -1322,7 +1408,7 @@
           </w:tcPr>
           <w:p>
             <w:r>
-              <w:t>Visa appointment (German embassy); flights</w:t>
+              <w:t>Visa grant; flights; housing via uni dorms</w:t>
             </w:r>
           </w:p>
         </w:tc>
@@ -1344,7 +1430,7 @@
           </w:tcPr>
           <w:p>
             <w:r>
-              <w:t>Pre-departure; secure housing via uni dorms</w:t>
+              <w:t>Pre-departure; blocked account activated</w:t>
             </w:r>
           </w:p>
         </w:tc>
@@ -1356,7 +1442,7 @@
           </w:tcPr>
           <w:p>
             <w:r>
-              <w:t>Oct 2027</w:t>
+              <w:t>Apr 2027 (intake)</w:t>
             </w:r>
           </w:p>
         </w:tc>
@@ -1366,7 +1452,7 @@
           </w:tcPr>
           <w:p>
             <w:r>
-              <w:t>Semester starts</w:t>
+              <w:t>Summer semester starts — if all went well, this is the goal</w:t>
             </w:r>
           </w:p>
         </w:tc>
@@ -1379,7 +1465,7 @@
           <w:color w:val="555F6E"/>
           <w:sz w:val="18"/>
         </w:rPr>
-        <w:t>If Winter 2026 wanted: compress — APS now, A1 by Nov, apply unis by Dec–Feb, B1 by May, depart Sep 2026.</w:t>
+        <w:t>If Summer 2027 slips → Winter 2027 becomes Plan B with B2 completed by Dec 2027.</w:t>
       </w:r>
     </w:p>
     <w:p>

</xml_diff>